<commit_message>
init + /etc config + accurate "free" memory
- /bin/init: the kernel now just launches /bin/init (no args); init reads
  /etc/autostart and runs each line as a shell command (user/bin/init.c). All launch
  policy lives in userland. StartAutostart() shrank to one ExecPath call.
- /etc: moved the general (non-app) config there -- /etc/autostart, /etc/quicklaunch.txt,
  /etc/theme.txt, /etc/system.ini. Updated all readers/writers (kernel ReadWindowTheme
  + ReadSystemConfig; panel; theme editor; verbose tool).
- meminfo now reports TRUE free memory: circle submodule bumped to onyx @ 9781e489,
  which adds free-list accounting to the page + heap allocators, and kapi_meminfo adds
  the reclaimable free-list space to the never-allocated region. memmon's "free" now
  rises again when memory is freed.

Co-Authored-By: Claude Opus 4.8 <noreply@anthropic.com>
</commit_message>
<xml_diff>
--- a/docs/exports/03-DEVELOPER-GUIDE.docx
+++ b/docs/exports/03-DEVELOPER-GUIDE.docx
@@ -833,7 +833,7 @@
       </w:r>
     </w:p>
     <w:bookmarkEnd w:id="20"/>
-    <w:bookmarkStart w:id="22" w:name="X003b220ca6cc44735cc8dfcf3146fe5e530b642"/>
+    <w:bookmarkStart w:id="23" w:name="X003b220ca6cc44735cc8dfcf3146fe5e530b642"/>
     <w:p>
       <w:pPr>
         <w:pStyle w:val="Heading2"/>
@@ -1981,8 +1981,60 @@
         <w:t xml:space="preserve">.</w:t>
       </w:r>
     </w:p>
-    <w:bookmarkEnd w:id="22"/>
-    <w:bookmarkStart w:id="24" w:name="X9e165b129e14646f0306cdf861efe74801e52e6"/>
+    <w:p>
+      <w:pPr>
+        <w:pStyle w:val="BlockText"/>
+      </w:pPr>
+      <w:r>
+        <w:t xml:space="preserve">The Onyx-specific patches carried by this fork (branch</w:t>
+      </w:r>
+      <w:r>
+        <w:t xml:space="preserve"> </w:t>
+      </w:r>
+      <w:r>
+        <w:rPr>
+          <w:rStyle w:val="VerbatimChar"/>
+        </w:rPr>
+        <w:t xml:space="preserve">onyx</w:t>
+      </w:r>
+      <w:r>
+        <w:t xml:space="preserve">, on upstream tag</w:t>
+      </w:r>
+      <w:r>
+        <w:t xml:space="preserve"> </w:t>
+      </w:r>
+      <w:r>
+        <w:rPr>
+          <w:rStyle w:val="VerbatimChar"/>
+        </w:rPr>
+        <w:t xml:space="preserve">Step51</w:t>
+      </w:r>
+      <w:r>
+        <w:t xml:space="preserve">)</w:t>
+      </w:r>
+      <w:r>
+        <w:t xml:space="preserve"> </w:t>
+      </w:r>
+      <w:r>
+        <w:t xml:space="preserve">are documented in</w:t>
+      </w:r>
+      <w:r>
+        <w:t xml:space="preserve"> </w:t>
+      </w:r>
+      <w:hyperlink r:id="rId22">
+        <w:r>
+          <w:rPr>
+            <w:rStyle w:val="Hyperlink"/>
+          </w:rPr>
+          <w:t xml:space="preserve">Circle Changes</w:t>
+        </w:r>
+      </w:hyperlink>
+      <w:r>
+        <w:t xml:space="preserve">.</w:t>
+      </w:r>
+    </w:p>
+    <w:bookmarkEnd w:id="23"/>
+    <w:bookmarkStart w:id="25" w:name="X9e165b129e14646f0306cdf861efe74801e52e6"/>
     <w:p>
       <w:pPr>
         <w:pStyle w:val="Heading2"/>
@@ -2327,7 +2379,7 @@
       <w:r>
         <w:t xml:space="preserve"> </w:t>
       </w:r>
-      <w:hyperlink r:id="rId23">
+      <w:hyperlink r:id="rId24">
         <w:r>
           <w:rPr>
             <w:rStyle w:val="Hyperlink"/>
@@ -2354,8 +2406,8 @@
         <w:t xml:space="preserve">.</w:t>
       </w:r>
     </w:p>
-    <w:bookmarkEnd w:id="24"/>
-    <w:bookmarkStart w:id="26" w:name="Xac7d0d56e73cf6e667e1011e3b2817670d84942"/>
+    <w:bookmarkEnd w:id="25"/>
+    <w:bookmarkStart w:id="27" w:name="Xac7d0d56e73cf6e667e1011e3b2817670d84942"/>
     <w:p>
       <w:pPr>
         <w:pStyle w:val="Heading2"/>
@@ -2613,7 +2665,7 @@
       <w:r>
         <w:t xml:space="preserve"> </w:t>
       </w:r>
-      <w:hyperlink r:id="rId25">
+      <w:hyperlink r:id="rId26">
         <w:r>
           <w:rPr>
             <w:rStyle w:val="Hyperlink"/>
@@ -2634,8 +2686,8 @@
         <w:t xml:space="preserve">the configuration files.</w:t>
       </w:r>
     </w:p>
-    <w:bookmarkEnd w:id="26"/>
-    <w:bookmarkStart w:id="31" w:name="X14c178ed9abbfa090eee6797105c19058b6d0b2"/>
+    <w:bookmarkEnd w:id="27"/>
+    <w:bookmarkStart w:id="32" w:name="X14c178ed9abbfa090eee6797105c19058b6d0b2"/>
     <w:p>
       <w:pPr>
         <w:pStyle w:val="Heading2"/>
@@ -2752,7 +2804,7 @@
       <w:r>
         <w:t xml:space="preserve">(</w:t>
       </w:r>
-      <w:hyperlink r:id="rId27">
+      <w:hyperlink r:id="rId28">
         <w:r>
           <w:rPr>
             <w:rStyle w:val="VerbatimChar"/>
@@ -3103,7 +3155,7 @@
       <w:r>
         <w:t xml:space="preserve">(</w:t>
       </w:r>
-      <w:hyperlink r:id="rId28">
+      <w:hyperlink r:id="rId29">
         <w:r>
           <w:rPr>
             <w:rStyle w:val="VerbatimChar"/>
@@ -3268,7 +3320,7 @@
       <w:r>
         <w:t xml:space="preserve">(</w:t>
       </w:r>
-      <w:hyperlink r:id="rId29">
+      <w:hyperlink r:id="rId30">
         <w:r>
           <w:rPr>
             <w:rStyle w:val="VerbatimChar"/>
@@ -3600,7 +3652,7 @@
       <w:r>
         <w:t xml:space="preserve"> </w:t>
       </w:r>
-      <w:hyperlink r:id="rId29">
+      <w:hyperlink r:id="rId30">
         <w:r>
           <w:rPr>
             <w:rStyle w:val="VerbatimChar"/>
@@ -3647,7 +3699,7 @@
       <w:r>
         <w:t xml:space="preserve"> </w:t>
       </w:r>
-      <w:hyperlink r:id="rId30">
+      <w:hyperlink r:id="rId31">
         <w:r>
           <w:rPr>
             <w:rStyle w:val="VerbatimChar"/>
@@ -3662,8 +3714,8 @@
         <w:t xml:space="preserve">for a tool).</w:t>
       </w:r>
     </w:p>
-    <w:bookmarkEnd w:id="31"/>
-    <w:bookmarkStart w:id="32" w:name="Xb2b57b3b718f4be25317d23f525cf8bb9daa0d0"/>
+    <w:bookmarkEnd w:id="32"/>
+    <w:bookmarkStart w:id="33" w:name="Xb2b57b3b718f4be25317d23f525cf8bb9daa0d0"/>
     <w:p>
       <w:pPr>
         <w:pStyle w:val="Heading2"/>
@@ -5134,8 +5186,8 @@
         <w:t xml:space="preserve">for complete examples.</w:t>
       </w:r>
     </w:p>
-    <w:bookmarkEnd w:id="32"/>
-    <w:bookmarkStart w:id="33" w:name="Xeac8a7f07d054ec4a738e7316cecd6b2667878f"/>
+    <w:bookmarkEnd w:id="33"/>
+    <w:bookmarkStart w:id="34" w:name="Xeac8a7f07d054ec4a738e7316cecd6b2667878f"/>
     <w:p>
       <w:pPr>
         <w:pStyle w:val="Heading2"/>
@@ -6409,8 +6461,8 @@
         <w:t xml:space="preserve">).</w:t>
       </w:r>
     </w:p>
-    <w:bookmarkEnd w:id="33"/>
-    <w:bookmarkStart w:id="41" w:name="Xf0254b5b66af42bca7d25138d14efff7271fb9a"/>
+    <w:bookmarkEnd w:id="34"/>
+    <w:bookmarkStart w:id="42" w:name="Xf0254b5b66af42bca7d25138d14efff7271fb9a"/>
     <w:p>
       <w:pPr>
         <w:pStyle w:val="Heading2"/>
@@ -6438,7 +6490,7 @@
       <w:pPr>
         <w:pStyle w:val="FirstParagraph"/>
       </w:pPr>
-      <w:hyperlink r:id="rId34">
+      <w:hyperlink r:id="rId35">
         <w:r>
           <w:rPr>
             <w:rStyle w:val="VerbatimChar"/>
@@ -6918,7 +6970,7 @@
       <w:r>
         <w:t xml:space="preserve"> </w:t>
       </w:r>
-      <w:hyperlink r:id="rId35">
+      <w:hyperlink r:id="rId36">
         <w:r>
           <w:rPr>
             <w:rStyle w:val="VerbatimChar"/>
@@ -7041,7 +7093,7 @@
       <w:r>
         <w:t xml:space="preserve"> </w:t>
       </w:r>
-      <w:hyperlink r:id="rId36">
+      <w:hyperlink r:id="rId37">
         <w:r>
           <w:rPr>
             <w:rStyle w:val="VerbatimChar"/>
@@ -7300,7 +7352,7 @@
         <w:t xml:space="preserve">…, §earlier) still work and coexist; apps choose one model per window.</w:t>
       </w:r>
     </w:p>
-    <w:bookmarkStart w:id="40" w:name="dynamic-memory--c-apps"/>
+    <w:bookmarkStart w:id="41" w:name="dynamic-memory--c-apps"/>
     <w:p>
       <w:pPr>
         <w:pStyle w:val="Heading3"/>
@@ -7370,7 +7422,7 @@
       <w:r>
         <w:t xml:space="preserve"> </w:t>
       </w:r>
-      <w:hyperlink r:id="rId37">
+      <w:hyperlink r:id="rId38">
         <w:r>
           <w:rPr>
             <w:rStyle w:val="VerbatimChar"/>
@@ -7666,7 +7718,7 @@
       <w:r>
         <w:t xml:space="preserve"> </w:t>
       </w:r>
-      <w:hyperlink r:id="rId38">
+      <w:hyperlink r:id="rId39">
         <w:r>
           <w:rPr>
             <w:rStyle w:val="VerbatimChar"/>
@@ -7900,7 +7952,7 @@
       <w:r>
         <w:t xml:space="preserve"> </w:t>
       </w:r>
-      <w:hyperlink r:id="rId39">
+      <w:hyperlink r:id="rId40">
         <w:r>
           <w:rPr>
             <w:rStyle w:val="VerbatimChar"/>
@@ -7915,9 +7967,9 @@
         <w:t xml:space="preserve">for a working example.</w:t>
       </w:r>
     </w:p>
-    <w:bookmarkEnd w:id="40"/>
     <w:bookmarkEnd w:id="41"/>
-    <w:bookmarkStart w:id="47" w:name="X636230dba256ccd30a2e68f8101290712b3f4c4"/>
+    <w:bookmarkEnd w:id="42"/>
+    <w:bookmarkStart w:id="48" w:name="X636230dba256ccd30a2e68f8101290712b3f4c4"/>
     <w:p>
       <w:pPr>
         <w:pStyle w:val="Heading2"/>
@@ -8109,7 +8161,7 @@
       <w:r>
         <w:t xml:space="preserve"> </w:t>
       </w:r>
-      <w:hyperlink r:id="rId42">
+      <w:hyperlink r:id="rId43">
         <w:r>
           <w:rPr>
             <w:rStyle w:val="VerbatimChar"/>
@@ -8190,7 +8242,7 @@
       <w:r>
         <w:t xml:space="preserve"> </w:t>
       </w:r>
-      <w:hyperlink r:id="rId43">
+      <w:hyperlink r:id="rId44">
         <w:r>
           <w:rPr>
             <w:rStyle w:val="VerbatimChar"/>
@@ -8454,7 +8506,7 @@
         <w:t xml:space="preserve">40</w:t>
       </w:r>
     </w:p>
-    <w:bookmarkStart w:id="46" w:name="screenshots-and-documentation"/>
+    <w:bookmarkStart w:id="47" w:name="screenshots-and-documentation"/>
     <w:p>
       <w:pPr>
         <w:pStyle w:val="Heading3"/>
@@ -8484,7 +8536,7 @@
       <w:r>
         <w:t xml:space="preserve"> </w:t>
       </w:r>
-      <w:hyperlink r:id="rId44">
+      <w:hyperlink r:id="rId45">
         <w:r>
           <w:rPr>
             <w:rStyle w:val="VerbatimChar"/>
@@ -8736,7 +8788,7 @@
       <w:r>
         <w:t xml:space="preserve"> </w:t>
       </w:r>
-      <w:hyperlink r:id="rId45">
+      <w:hyperlink r:id="rId46">
         <w:r>
           <w:rPr>
             <w:rStyle w:val="VerbatimChar"/>
@@ -8960,9 +9012,9 @@
         <w:t xml:space="preserve">screenshot if the visual changes, then regenerates the exports.</w:t>
       </w:r>
     </w:p>
-    <w:bookmarkEnd w:id="46"/>
     <w:bookmarkEnd w:id="47"/>
-    <w:bookmarkStart w:id="48" w:name="Xc2ec260aede7afe7fa831ade27ff6c6be860f38"/>
+    <w:bookmarkEnd w:id="48"/>
+    <w:bookmarkStart w:id="49" w:name="Xc2ec260aede7afe7fa831ade27ff6c6be860f38"/>
     <w:p>
       <w:pPr>
         <w:pStyle w:val="Heading2"/>
@@ -9689,8 +9741,8 @@
         <w:t xml:space="preserve">"must match").</w:t>
       </w:r>
     </w:p>
-    <w:bookmarkEnd w:id="48"/>
-    <w:bookmarkStart w:id="49" w:name="X57cc4a25254639a1e87307c03f7beba3c173828"/>
+    <w:bookmarkEnd w:id="49"/>
+    <w:bookmarkStart w:id="50" w:name="X57cc4a25254639a1e87307c03f7beba3c173828"/>
     <w:p>
       <w:pPr>
         <w:pStyle w:val="Heading2"/>
@@ -10066,8 +10118,8 @@
         <w:t xml:space="preserve">committed in this repo.)</w:t>
       </w:r>
     </w:p>
-    <w:bookmarkEnd w:id="49"/>
-    <w:bookmarkStart w:id="51" w:name="Xe2e8f17f312baf0f280f8a3dfcc5fa34b4105bf"/>
+    <w:bookmarkEnd w:id="50"/>
+    <w:bookmarkStart w:id="52" w:name="Xe2e8f17f312baf0f280f8a3dfcc5fa34b4105bf"/>
     <w:p>
       <w:pPr>
         <w:pStyle w:val="Heading2"/>
@@ -10339,7 +10391,7 @@
       <w:r>
         <w:t xml:space="preserve"> </w:t>
       </w:r>
-      <w:hyperlink r:id="rId50">
+      <w:hyperlink r:id="rId51">
         <w:r>
           <w:rPr>
             <w:rStyle w:val="Hyperlink"/>
@@ -10351,8 +10403,8 @@
         <w:t xml:space="preserve">).</w:t>
       </w:r>
     </w:p>
-    <w:bookmarkEnd w:id="51"/>
-    <w:bookmarkStart w:id="53" w:name="Xe9c7e4e932ad1908138a3909ff179a810da6d71"/>
+    <w:bookmarkEnd w:id="52"/>
+    <w:bookmarkStart w:id="54" w:name="Xe9c7e4e932ad1908138a3909ff179a810da6d71"/>
     <w:p>
       <w:pPr>
         <w:pStyle w:val="Heading2"/>
@@ -10434,7 +10486,7 @@
       <w:r>
         <w:t xml:space="preserve"> </w:t>
       </w:r>
-      <w:hyperlink r:id="rId52">
+      <w:hyperlink r:id="rId53">
         <w:r>
           <w:rPr>
             <w:rStyle w:val="Hyperlink"/>
@@ -10700,7 +10752,7 @@
         <w:t xml:space="preserve">, not another clone.</w:t>
       </w:r>
     </w:p>
-    <w:bookmarkEnd w:id="53"/>
+    <w:bookmarkEnd w:id="54"/>
     <w:sectPr>
       <w:footerReference r:id="rId9" w:type="default"/>
       <w:footnotePr>

</xml_diff>

<commit_message>
docs(dev-guide): Circle is a git submodule, not a separate clone
Update §1 and §2 of the Developer Guide to reflect that `circle/` is a git
submodule (fork stephaneweg/circle, branch onyx): fetch it with
`git submodule update --init --recursive` instead of cloning rsta2/circle and
renormalizing CRLF; patch on the `onyx` branch and bump the submodule in the
superproject. Regenerate the Word/PDF exports.

Co-Authored-By: Claude Opus 4.8 <noreply@anthropic.com>
</commit_message>
<xml_diff>
--- a/docs/exports/03-DEVELOPER-GUIDE.docx
+++ b/docs/exports/03-DEVELOPER-GUIDE.docx
@@ -520,7 +520,7 @@
       </w:r>
     </w:p>
     <w:bookmarkEnd w:id="19"/>
-    <w:bookmarkStart w:id="20" w:name="Xd2b406271b25506e92c7158b4a31284694b1f70"/>
+    <w:bookmarkStart w:id="21" w:name="Xd2b406271b25506e92c7158b4a31284694b1f70"/>
     <w:p>
       <w:pPr>
         <w:pStyle w:val="Heading2"/>
@@ -601,32 +601,59 @@
         <w:t xml:space="preserve">Circle</w:t>
       </w:r>
       <w:r>
-        <w:t xml:space="preserve">, cloned</w:t>
-      </w:r>
-      <w:r>
-        <w:t xml:space="preserve"> </w:t>
-      </w:r>
-      <w:r>
-        <w:rPr>
-          <w:b/>
-          <w:bCs/>
-        </w:rPr>
-        <w:t xml:space="preserve">next to</w:t>
-      </w:r>
-      <w:r>
-        <w:t xml:space="preserve"> </w:t>
-      </w:r>
-      <w:r>
-        <w:t xml:space="preserve">the kernel tree (in</w:t>
-      </w:r>
-      <w:r>
-        <w:t xml:space="preserve"> </w:t>
-      </w:r>
-      <w:r>
-        <w:rPr>
-          <w:rStyle w:val="VerbatimChar"/>
-        </w:rPr>
-        <w:t xml:space="preserve">Zircon/circle/</w:t>
+        <w:t xml:space="preserve">, pulled in as a</w:t>
+      </w:r>
+      <w:r>
+        <w:t xml:space="preserve"> </w:t>
+      </w:r>
+      <w:r>
+        <w:rPr>
+          <w:b/>
+          <w:bCs/>
+        </w:rPr>
+        <w:t xml:space="preserve">git submodule</w:t>
+      </w:r>
+      <w:r>
+        <w:t xml:space="preserve"> </w:t>
+      </w:r>
+      <w:r>
+        <w:t xml:space="preserve">at</w:t>
+      </w:r>
+      <w:r>
+        <w:t xml:space="preserve"> </w:t>
+      </w:r>
+      <w:r>
+        <w:rPr>
+          <w:rStyle w:val="VerbatimChar"/>
+        </w:rPr>
+        <w:t xml:space="preserve">circle/</w:t>
+      </w:r>
+      <w:r>
+        <w:t xml:space="preserve"> </w:t>
+      </w:r>
+      <w:r>
+        <w:t xml:space="preserve">(our fork</w:t>
+      </w:r>
+      <w:r>
+        <w:t xml:space="preserve"> </w:t>
+      </w:r>
+      <w:r>
+        <w:rPr>
+          <w:rStyle w:val="VerbatimChar"/>
+        </w:rPr>
+        <w:t xml:space="preserve">stephaneweg/circle</w:t>
+      </w:r>
+      <w:r>
+        <w:t xml:space="preserve">, branch</w:t>
+      </w:r>
+      <w:r>
+        <w:t xml:space="preserve"> </w:t>
+      </w:r>
+      <w:r>
+        <w:rPr>
+          <w:rStyle w:val="VerbatimChar"/>
+        </w:rPr>
+        <w:t xml:space="preserve">onyx</w:t>
       </w:r>
       <w:r>
         <w:t xml:space="preserve">).</w:t>
@@ -757,30 +784,59 @@
         <w:t xml:space="preserve"> </w:t>
       </w:r>
       <w:r>
-        <w:t xml:space="preserve">The Circle to modify is</w:t>
-      </w:r>
-      <w:r>
-        <w:t xml:space="preserve"> </w:t>
-      </w:r>
-      <w:r>
-        <w:rPr>
-          <w:rStyle w:val="VerbatimChar"/>
-          <w:b/>
-          <w:bCs/>
-        </w:rPr>
-        <w:t xml:space="preserve">Zircon/circle</w:t>
-      </w:r>
-      <w:r>
-        <w:t xml:space="preserve"> </w:t>
-      </w:r>
-      <w:r>
-        <w:t xml:space="preserve">(the clone next</w:t>
-      </w:r>
-      <w:r>
-        <w:t xml:space="preserve"> </w:t>
-      </w:r>
-      <w:r>
-        <w:t xml:space="preserve">to the kernel),</w:t>
+        <w:rPr>
+          <w:rStyle w:val="VerbatimChar"/>
+        </w:rPr>
+        <w:t xml:space="preserve">circle/</w:t>
+      </w:r>
+      <w:r>
+        <w:t xml:space="preserve"> </w:t>
+      </w:r>
+      <w:r>
+        <w:t xml:space="preserve">is a</w:t>
+      </w:r>
+      <w:r>
+        <w:t xml:space="preserve"> </w:t>
+      </w:r>
+      <w:r>
+        <w:rPr>
+          <w:b/>
+          <w:bCs/>
+        </w:rPr>
+        <w:t xml:space="preserve">git submodule</w:t>
+      </w:r>
+      <w:r>
+        <w:t xml:space="preserve"> </w:t>
+      </w:r>
+      <w:r>
+        <w:t xml:space="preserve">→ our fork</w:t>
+      </w:r>
+      <w:r>
+        <w:t xml:space="preserve"> </w:t>
+      </w:r>
+      <w:r>
+        <w:rPr>
+          <w:rStyle w:val="VerbatimChar"/>
+        </w:rPr>
+        <w:t xml:space="preserve">stephaneweg/circle</w:t>
+      </w:r>
+      <w:r>
+        <w:t xml:space="preserve"> </w:t>
+      </w:r>
+      <w:r>
+        <w:t xml:space="preserve">(branch</w:t>
+      </w:r>
+      <w:r>
+        <w:t xml:space="preserve"> </w:t>
+      </w:r>
+      <w:r>
+        <w:rPr>
+          <w:rStyle w:val="VerbatimChar"/>
+        </w:rPr>
+        <w:t xml:space="preserve">onyx</w:t>
+      </w:r>
+      <w:r>
+        <w:t xml:space="preserve">),</w:t>
       </w:r>
       <w:r>
         <w:t xml:space="preserve"> </w:t>
@@ -796,43 +852,67 @@
         <w:t xml:space="preserve"> </w:t>
       </w:r>
       <w:r>
-        <w:t xml:space="preserve">any</w:t>
-      </w:r>
-      <w:r>
-        <w:t xml:space="preserve"> </w:t>
-      </w:r>
-      <w:r>
-        <w:rPr>
-          <w:rStyle w:val="VerbatimChar"/>
-        </w:rPr>
-        <w:t xml:space="preserve">C:\Temp\circle</w:t>
-      </w:r>
-      <w:r>
-        <w:t xml:space="preserve">. If you patch Circle (e.g. a</w:t>
-      </w:r>
-      <w:r>
-        <w:t xml:space="preserve"> </w:t>
-      </w:r>
-      <w:r>
-        <w:t xml:space="preserve">keymap), do it in</w:t>
-      </w:r>
-      <w:r>
-        <w:t xml:space="preserve"> </w:t>
-      </w:r>
-      <w:r>
-        <w:rPr>
-          <w:rStyle w:val="VerbatimChar"/>
-        </w:rPr>
-        <w:t xml:space="preserve">Zircon/circle</w:t>
-      </w:r>
-      <w:r>
-        <w:t xml:space="preserve"> </w:t>
-      </w:r>
-      <w:r>
-        <w:t xml:space="preserve">and rebuild the affected library.</w:t>
-      </w:r>
-    </w:p>
-    <w:bookmarkEnd w:id="20"/>
+        <w:t xml:space="preserve">any other clone. Patch Circle</w:t>
+      </w:r>
+      <w:r>
+        <w:t xml:space="preserve"> </w:t>
+      </w:r>
+      <w:r>
+        <w:rPr>
+          <w:i/>
+          <w:iCs/>
+        </w:rPr>
+        <w:t xml:space="preserve">there</w:t>
+      </w:r>
+      <w:r>
+        <w:t xml:space="preserve"> </w:t>
+      </w:r>
+      <w:r>
+        <w:t xml:space="preserve">(commit on</w:t>
+      </w:r>
+      <w:r>
+        <w:t xml:space="preserve"> </w:t>
+      </w:r>
+      <w:r>
+        <w:rPr>
+          <w:rStyle w:val="VerbatimChar"/>
+        </w:rPr>
+        <w:t xml:space="preserve">onyx</w:t>
+      </w:r>
+      <w:r>
+        <w:t xml:space="preserve">), rebuild the affected library, then record the new commit in the</w:t>
+      </w:r>
+      <w:r>
+        <w:t xml:space="preserve"> </w:t>
+      </w:r>
+      <w:r>
+        <w:t xml:space="preserve">superproject (</w:t>
+      </w:r>
+      <w:r>
+        <w:rPr>
+          <w:rStyle w:val="VerbatimChar"/>
+        </w:rPr>
+        <w:t xml:space="preserve">git add circle &amp;&amp; git commit</w:t>
+      </w:r>
+      <w:r>
+        <w:t xml:space="preserve">). The patches are listed in</w:t>
+      </w:r>
+      <w:r>
+        <w:t xml:space="preserve"> </w:t>
+      </w:r>
+      <w:hyperlink r:id="rId20">
+        <w:r>
+          <w:rPr>
+            <w:rStyle w:val="Hyperlink"/>
+          </w:rPr>
+          <w:t xml:space="preserve">Circle Changes</w:t>
+        </w:r>
+      </w:hyperlink>
+      <w:r>
+        <w:t xml:space="preserve">.</w:t>
+      </w:r>
+    </w:p>
+    <w:bookmarkEnd w:id="21"/>
     <w:bookmarkStart w:id="23" w:name="X003b220ca6cc44735cc8dfcf3146fe5e530b642"/>
     <w:p>
       <w:pPr>
@@ -850,13 +930,22 @@
         <w:rPr>
           <w:rStyle w:val="CommentTok"/>
         </w:rPr>
-        <w:t xml:space="preserve"># From the repo root (Zircon/), clone Circle next to the kernel:</w:t>
+        <w:t xml:space="preserve"># Circle is a git submodule (the fork stephaneweg/circle, branch onyx). Fetch it</w:t>
       </w:r>
       <w:r>
         <w:br/>
       </w:r>
       <w:r>
         <w:rPr>
+          <w:rStyle w:val="CommentTok"/>
+        </w:rPr>
+        <w:t xml:space="preserve"># (or clone Onyx with --recurse-submodules in the first place):</w:t>
+      </w:r>
+      <w:r>
+        <w:br/>
+      </w:r>
+      <w:r>
+        <w:rPr>
           <w:rStyle w:val="FunctionTok"/>
         </w:rPr>
         <w:t xml:space="preserve">git</w:t>
@@ -865,19 +954,25 @@
         <w:rPr>
           <w:rStyle w:val="NormalTok"/>
         </w:rPr>
-        <w:t xml:space="preserve"> clone </w:t>
+        <w:t xml:space="preserve"> submodule update </w:t>
       </w:r>
       <w:r>
         <w:rPr>
           <w:rStyle w:val="AttributeTok"/>
         </w:rPr>
-        <w:t xml:space="preserve">--recurse-submodules</w:t>
-      </w:r>
-      <w:r>
-        <w:rPr>
-          <w:rStyle w:val="NormalTok"/>
-        </w:rPr>
-        <w:t xml:space="preserve"> https://github.com/rsta2/circle.git</w:t>
+        <w:t xml:space="preserve">--init</w:t>
+      </w:r>
+      <w:r>
+        <w:rPr>
+          <w:rStyle w:val="NormalTok"/>
+        </w:rPr>
+        <w:t xml:space="preserve"> </w:t>
+      </w:r>
+      <w:r>
+        <w:rPr>
+          <w:rStyle w:val="AttributeTok"/>
+        </w:rPr>
+        <w:t xml:space="preserve">--recursive</w:t>
       </w:r>
       <w:r>
         <w:br/>
@@ -889,16 +984,148 @@
         <w:rPr>
           <w:rStyle w:val="CommentTok"/>
         </w:rPr>
-        <w:t xml:space="preserve"># Circle was checked out as CRLF on Windows -&gt; renormalize to LF once:</w:t>
+        <w:t xml:space="preserve"># Configure for RPi 4 / AArch64. DEPTH=32 is REQUIRED: our GImage renders 32-bit</w:t>
       </w:r>
       <w:r>
         <w:br/>
       </w:r>
       <w:r>
         <w:rPr>
+          <w:rStyle w:val="CommentTok"/>
+        </w:rPr>
+        <w:t xml:space="preserve"># pixels (Circle defaults to 16).</w:t>
+      </w:r>
+      <w:r>
+        <w:br/>
+      </w:r>
+      <w:r>
+        <w:rPr>
+          <w:rStyle w:val="BuiltInTok"/>
+        </w:rPr>
+        <w:t xml:space="preserve">cd</w:t>
+      </w:r>
+      <w:r>
+        <w:rPr>
+          <w:rStyle w:val="NormalTok"/>
+        </w:rPr>
+        <w:t xml:space="preserve"> circle </w:t>
+      </w:r>
+      <w:r>
+        <w:rPr>
+          <w:rStyle w:val="KeywordTok"/>
+        </w:rPr>
+        <w:t xml:space="preserve">&amp;&amp;</w:t>
+      </w:r>
+      <w:r>
+        <w:rPr>
+          <w:rStyle w:val="NormalTok"/>
+        </w:rPr>
+        <w:t xml:space="preserve"> </w:t>
+      </w:r>
+      <w:r>
+        <w:rPr>
+          <w:rStyle w:val="ExtensionTok"/>
+        </w:rPr>
+        <w:t xml:space="preserve">./configure</w:t>
+      </w:r>
+      <w:r>
+        <w:rPr>
+          <w:rStyle w:val="NormalTok"/>
+        </w:rPr>
+        <w:t xml:space="preserve"> </w:t>
+      </w:r>
+      <w:r>
+        <w:rPr>
+          <w:rStyle w:val="AttributeTok"/>
+        </w:rPr>
+        <w:t xml:space="preserve">-r</w:t>
+      </w:r>
+      <w:r>
+        <w:rPr>
+          <w:rStyle w:val="NormalTok"/>
+        </w:rPr>
+        <w:t xml:space="preserve"> 4 </w:t>
+      </w:r>
+      <w:r>
+        <w:rPr>
+          <w:rStyle w:val="AttributeTok"/>
+        </w:rPr>
+        <w:t xml:space="preserve">-p</w:t>
+      </w:r>
+      <w:r>
+        <w:rPr>
+          <w:rStyle w:val="NormalTok"/>
+        </w:rPr>
+        <w:t xml:space="preserve"> aarch64-none-elf- </w:t>
+      </w:r>
+      <w:r>
+        <w:rPr>
+          <w:rStyle w:val="AttributeTok"/>
+        </w:rPr>
+        <w:t xml:space="preserve">-d</w:t>
+      </w:r>
+      <w:r>
+        <w:rPr>
+          <w:rStyle w:val="NormalTok"/>
+        </w:rPr>
+        <w:t xml:space="preserve"> DEPTH=32 </w:t>
+      </w:r>
+      <w:r>
+        <w:rPr>
+          <w:rStyle w:val="AttributeTok"/>
+        </w:rPr>
+        <w:t xml:space="preserve">-f</w:t>
+      </w:r>
+      <w:r>
+        <w:br/>
+      </w:r>
+      <w:r>
+        <w:br/>
+      </w:r>
+      <w:r>
+        <w:rPr>
+          <w:rStyle w:val="CommentTok"/>
+        </w:rPr>
+        <w:t xml:space="preserve"># Build the libraries used by the kernel:</w:t>
+      </w:r>
+      <w:r>
+        <w:br/>
+      </w:r>
+      <w:r>
+        <w:rPr>
+          <w:rStyle w:val="KeywordTok"/>
+        </w:rPr>
+        <w:t xml:space="preserve">(</w:t>
+      </w:r>
+      <w:r>
+        <w:rPr>
+          <w:rStyle w:val="BuiltInTok"/>
+        </w:rPr>
+        <w:t xml:space="preserve">cd</w:t>
+      </w:r>
+      <w:r>
+        <w:rPr>
+          <w:rStyle w:val="NormalTok"/>
+        </w:rPr>
+        <w:t xml:space="preserve"> lib </w:t>
+      </w:r>
+      <w:r>
+        <w:rPr>
+          <w:rStyle w:val="KeywordTok"/>
+        </w:rPr>
+        <w:t xml:space="preserve">&amp;&amp;</w:t>
+      </w:r>
+      <w:r>
+        <w:rPr>
+          <w:rStyle w:val="NormalTok"/>
+        </w:rPr>
+        <w:t xml:space="preserve"> </w:t>
+      </w:r>
+      <w:r>
+        <w:rPr>
           <w:rStyle w:val="FunctionTok"/>
         </w:rPr>
-        <w:t xml:space="preserve">git</w:t>
+        <w:t xml:space="preserve">make</w:t>
       </w:r>
       <w:r>
         <w:rPr>
@@ -910,18 +1137,39 @@
         <w:rPr>
           <w:rStyle w:val="AttributeTok"/>
         </w:rPr>
-        <w:t xml:space="preserve">-C</w:t>
-      </w:r>
-      <w:r>
-        <w:rPr>
-          <w:rStyle w:val="NormalTok"/>
-        </w:rPr>
-        <w:t xml:space="preserve"> circle config core.autocrlf false </w:t>
+        <w:t xml:space="preserve">-j4</w:t>
       </w:r>
       <w:r>
         <w:rPr>
           <w:rStyle w:val="KeywordTok"/>
         </w:rPr>
+        <w:t xml:space="preserve">)</w:t>
+      </w:r>
+      <w:r>
+        <w:rPr>
+          <w:rStyle w:val="NormalTok"/>
+        </w:rPr>
+        <w:t xml:space="preserve"> </w:t>
+      </w:r>
+      <w:r>
+        <w:rPr>
+          <w:rStyle w:val="DataTypeTok"/>
+        </w:rPr>
+        <w:t xml:space="preserve">\</w:t>
+      </w:r>
+      <w:r>
+        <w:br/>
+      </w:r>
+      <w:r>
+        <w:rPr>
+          <w:rStyle w:val="NormalTok"/>
+        </w:rPr>
+        <w:t xml:space="preserve">  </w:t>
+      </w:r>
+      <w:r>
+        <w:rPr>
+          <w:rStyle w:val="KeywordTok"/>
+        </w:rPr>
         <w:t xml:space="preserve">&amp;&amp;</w:t>
       </w:r>
       <w:r>
@@ -932,9 +1180,39 @@
       </w:r>
       <w:r>
         <w:rPr>
+          <w:rStyle w:val="KeywordTok"/>
+        </w:rPr>
+        <w:t xml:space="preserve">(</w:t>
+      </w:r>
+      <w:r>
+        <w:rPr>
+          <w:rStyle w:val="BuiltInTok"/>
+        </w:rPr>
+        <w:t xml:space="preserve">cd</w:t>
+      </w:r>
+      <w:r>
+        <w:rPr>
+          <w:rStyle w:val="NormalTok"/>
+        </w:rPr>
+        <w:t xml:space="preserve"> lib/sched </w:t>
+      </w:r>
+      <w:r>
+        <w:rPr>
+          <w:rStyle w:val="KeywordTok"/>
+        </w:rPr>
+        <w:t xml:space="preserve">&amp;&amp;</w:t>
+      </w:r>
+      <w:r>
+        <w:rPr>
+          <w:rStyle w:val="NormalTok"/>
+        </w:rPr>
+        <w:t xml:space="preserve"> </w:t>
+      </w:r>
+      <w:r>
+        <w:rPr>
           <w:rStyle w:val="FunctionTok"/>
         </w:rPr>
-        <w:t xml:space="preserve">git</w:t>
+        <w:t xml:space="preserve">make</w:t>
       </w:r>
       <w:r>
         <w:rPr>
@@ -946,19 +1224,142 @@
         <w:rPr>
           <w:rStyle w:val="AttributeTok"/>
         </w:rPr>
-        <w:t xml:space="preserve">-C</w:t>
-      </w:r>
-      <w:r>
-        <w:rPr>
-          <w:rStyle w:val="NormalTok"/>
-        </w:rPr>
-        <w:t xml:space="preserve"> circle rm </w:t>
+        <w:t xml:space="preserve">-j4</w:t>
+      </w:r>
+      <w:r>
+        <w:rPr>
+          <w:rStyle w:val="KeywordTok"/>
+        </w:rPr>
+        <w:t xml:space="preserve">)</w:t>
+      </w:r>
+      <w:r>
+        <w:rPr>
+          <w:rStyle w:val="NormalTok"/>
+        </w:rPr>
+        <w:t xml:space="preserve"> </w:t>
+      </w:r>
+      <w:r>
+        <w:rPr>
+          <w:rStyle w:val="DataTypeTok"/>
+        </w:rPr>
+        <w:t xml:space="preserve">\</w:t>
+      </w:r>
+      <w:r>
+        <w:br/>
+      </w:r>
+      <w:r>
+        <w:rPr>
+          <w:rStyle w:val="NormalTok"/>
+        </w:rPr>
+        <w:t xml:space="preserve">  </w:t>
+      </w:r>
+      <w:r>
+        <w:rPr>
+          <w:rStyle w:val="KeywordTok"/>
+        </w:rPr>
+        <w:t xml:space="preserve">&amp;&amp;</w:t>
+      </w:r>
+      <w:r>
+        <w:rPr>
+          <w:rStyle w:val="NormalTok"/>
+        </w:rPr>
+        <w:t xml:space="preserve"> </w:t>
+      </w:r>
+      <w:r>
+        <w:rPr>
+          <w:rStyle w:val="KeywordTok"/>
+        </w:rPr>
+        <w:t xml:space="preserve">(</w:t>
+      </w:r>
+      <w:r>
+        <w:rPr>
+          <w:rStyle w:val="BuiltInTok"/>
+        </w:rPr>
+        <w:t xml:space="preserve">cd</w:t>
+      </w:r>
+      <w:r>
+        <w:rPr>
+          <w:rStyle w:val="NormalTok"/>
+        </w:rPr>
+        <w:t xml:space="preserve"> lib/fs </w:t>
+      </w:r>
+      <w:r>
+        <w:rPr>
+          <w:rStyle w:val="KeywordTok"/>
+        </w:rPr>
+        <w:t xml:space="preserve">&amp;&amp;</w:t>
+      </w:r>
+      <w:r>
+        <w:rPr>
+          <w:rStyle w:val="NormalTok"/>
+        </w:rPr>
+        <w:t xml:space="preserve"> </w:t>
+      </w:r>
+      <w:r>
+        <w:rPr>
+          <w:rStyle w:val="FunctionTok"/>
+        </w:rPr>
+        <w:t xml:space="preserve">make</w:t>
+      </w:r>
+      <w:r>
+        <w:rPr>
+          <w:rStyle w:val="NormalTok"/>
+        </w:rPr>
+        <w:t xml:space="preserve"> </w:t>
       </w:r>
       <w:r>
         <w:rPr>
           <w:rStyle w:val="AttributeTok"/>
         </w:rPr>
-        <w:t xml:space="preserve">--cached</w:t>
+        <w:t xml:space="preserve">-j4</w:t>
+      </w:r>
+      <w:r>
+        <w:rPr>
+          <w:rStyle w:val="NormalTok"/>
+        </w:rPr>
+        <w:t xml:space="preserve"> </w:t>
+      </w:r>
+      <w:r>
+        <w:rPr>
+          <w:rStyle w:val="KeywordTok"/>
+        </w:rPr>
+        <w:t xml:space="preserve">&amp;&amp;</w:t>
+      </w:r>
+      <w:r>
+        <w:rPr>
+          <w:rStyle w:val="NormalTok"/>
+        </w:rPr>
+        <w:t xml:space="preserve"> </w:t>
+      </w:r>
+      <w:r>
+        <w:rPr>
+          <w:rStyle w:val="BuiltInTok"/>
+        </w:rPr>
+        <w:t xml:space="preserve">cd</w:t>
+      </w:r>
+      <w:r>
+        <w:rPr>
+          <w:rStyle w:val="NormalTok"/>
+        </w:rPr>
+        <w:t xml:space="preserve"> fat </w:t>
+      </w:r>
+      <w:r>
+        <w:rPr>
+          <w:rStyle w:val="KeywordTok"/>
+        </w:rPr>
+        <w:t xml:space="preserve">&amp;&amp;</w:t>
+      </w:r>
+      <w:r>
+        <w:rPr>
+          <w:rStyle w:val="NormalTok"/>
+        </w:rPr>
+        <w:t xml:space="preserve"> </w:t>
+      </w:r>
+      <w:r>
+        <w:rPr>
+          <w:rStyle w:val="FunctionTok"/>
+        </w:rPr>
+        <w:t xml:space="preserve">make</w:t>
       </w:r>
       <w:r>
         <w:rPr>
@@ -970,18 +1371,39 @@
         <w:rPr>
           <w:rStyle w:val="AttributeTok"/>
         </w:rPr>
-        <w:t xml:space="preserve">-rq</w:t>
-      </w:r>
-      <w:r>
-        <w:rPr>
-          <w:rStyle w:val="NormalTok"/>
-        </w:rPr>
-        <w:t xml:space="preserve"> . </w:t>
+        <w:t xml:space="preserve">-j4</w:t>
       </w:r>
       <w:r>
         <w:rPr>
           <w:rStyle w:val="KeywordTok"/>
         </w:rPr>
+        <w:t xml:space="preserve">)</w:t>
+      </w:r>
+      <w:r>
+        <w:rPr>
+          <w:rStyle w:val="NormalTok"/>
+        </w:rPr>
+        <w:t xml:space="preserve"> </w:t>
+      </w:r>
+      <w:r>
+        <w:rPr>
+          <w:rStyle w:val="DataTypeTok"/>
+        </w:rPr>
+        <w:t xml:space="preserve">\</w:t>
+      </w:r>
+      <w:r>
+        <w:br/>
+      </w:r>
+      <w:r>
+        <w:rPr>
+          <w:rStyle w:val="NormalTok"/>
+        </w:rPr>
+        <w:t xml:space="preserve">  </w:t>
+      </w:r>
+      <w:r>
+        <w:rPr>
+          <w:rStyle w:val="KeywordTok"/>
+        </w:rPr>
         <w:t xml:space="preserve">&amp;&amp;</w:t>
       </w:r>
       <w:r>
@@ -992,9 +1414,39 @@
       </w:r>
       <w:r>
         <w:rPr>
+          <w:rStyle w:val="KeywordTok"/>
+        </w:rPr>
+        <w:t xml:space="preserve">(</w:t>
+      </w:r>
+      <w:r>
+        <w:rPr>
+          <w:rStyle w:val="BuiltInTok"/>
+        </w:rPr>
+        <w:t xml:space="preserve">cd</w:t>
+      </w:r>
+      <w:r>
+        <w:rPr>
+          <w:rStyle w:val="NormalTok"/>
+        </w:rPr>
+        <w:t xml:space="preserve"> lib/usb </w:t>
+      </w:r>
+      <w:r>
+        <w:rPr>
+          <w:rStyle w:val="KeywordTok"/>
+        </w:rPr>
+        <w:t xml:space="preserve">&amp;&amp;</w:t>
+      </w:r>
+      <w:r>
+        <w:rPr>
+          <w:rStyle w:val="NormalTok"/>
+        </w:rPr>
+        <w:t xml:space="preserve"> </w:t>
+      </w:r>
+      <w:r>
+        <w:rPr>
           <w:rStyle w:val="FunctionTok"/>
         </w:rPr>
-        <w:t xml:space="preserve">git</w:t>
+        <w:t xml:space="preserve">make</w:t>
       </w:r>
       <w:r>
         <w:rPr>
@@ -1006,46 +1458,280 @@
         <w:rPr>
           <w:rStyle w:val="AttributeTok"/>
         </w:rPr>
-        <w:t xml:space="preserve">-C</w:t>
-      </w:r>
-      <w:r>
-        <w:rPr>
-          <w:rStyle w:val="NormalTok"/>
-        </w:rPr>
-        <w:t xml:space="preserve"> circle reset </w:t>
+        <w:t xml:space="preserve">-j4</w:t>
+      </w:r>
+      <w:r>
+        <w:rPr>
+          <w:rStyle w:val="KeywordTok"/>
+        </w:rPr>
+        <w:t xml:space="preserve">)</w:t>
+      </w:r>
+      <w:r>
+        <w:rPr>
+          <w:rStyle w:val="NormalTok"/>
+        </w:rPr>
+        <w:t xml:space="preserve"> </w:t>
+      </w:r>
+      <w:r>
+        <w:rPr>
+          <w:rStyle w:val="DataTypeTok"/>
+        </w:rPr>
+        <w:t xml:space="preserve">\</w:t>
+      </w:r>
+      <w:r>
+        <w:br/>
+      </w:r>
+      <w:r>
+        <w:rPr>
+          <w:rStyle w:val="NormalTok"/>
+        </w:rPr>
+        <w:t xml:space="preserve">  </w:t>
+      </w:r>
+      <w:r>
+        <w:rPr>
+          <w:rStyle w:val="KeywordTok"/>
+        </w:rPr>
+        <w:t xml:space="preserve">&amp;&amp;</w:t>
+      </w:r>
+      <w:r>
+        <w:rPr>
+          <w:rStyle w:val="NormalTok"/>
+        </w:rPr>
+        <w:t xml:space="preserve"> </w:t>
+      </w:r>
+      <w:r>
+        <w:rPr>
+          <w:rStyle w:val="KeywordTok"/>
+        </w:rPr>
+        <w:t xml:space="preserve">(</w:t>
+      </w:r>
+      <w:r>
+        <w:rPr>
+          <w:rStyle w:val="BuiltInTok"/>
+        </w:rPr>
+        <w:t xml:space="preserve">cd</w:t>
+      </w:r>
+      <w:r>
+        <w:rPr>
+          <w:rStyle w:val="NormalTok"/>
+        </w:rPr>
+        <w:t xml:space="preserve"> lib/input </w:t>
+      </w:r>
+      <w:r>
+        <w:rPr>
+          <w:rStyle w:val="KeywordTok"/>
+        </w:rPr>
+        <w:t xml:space="preserve">&amp;&amp;</w:t>
+      </w:r>
+      <w:r>
+        <w:rPr>
+          <w:rStyle w:val="NormalTok"/>
+        </w:rPr>
+        <w:t xml:space="preserve"> </w:t>
+      </w:r>
+      <w:r>
+        <w:rPr>
+          <w:rStyle w:val="FunctionTok"/>
+        </w:rPr>
+        <w:t xml:space="preserve">make</w:t>
+      </w:r>
+      <w:r>
+        <w:rPr>
+          <w:rStyle w:val="NormalTok"/>
+        </w:rPr>
+        <w:t xml:space="preserve"> </w:t>
       </w:r>
       <w:r>
         <w:rPr>
           <w:rStyle w:val="AttributeTok"/>
         </w:rPr>
-        <w:t xml:space="preserve">--hard</w:t>
+        <w:t xml:space="preserve">-j4</w:t>
+      </w:r>
+      <w:r>
+        <w:rPr>
+          <w:rStyle w:val="KeywordTok"/>
+        </w:rPr>
+        <w:t xml:space="preserve">)</w:t>
+      </w:r>
+      <w:r>
+        <w:rPr>
+          <w:rStyle w:val="NormalTok"/>
+        </w:rPr>
+        <w:t xml:space="preserve"> </w:t>
+      </w:r>
+      <w:r>
+        <w:rPr>
+          <w:rStyle w:val="DataTypeTok"/>
+        </w:rPr>
+        <w:t xml:space="preserve">\</w:t>
       </w:r>
       <w:r>
         <w:br/>
       </w:r>
       <w:r>
+        <w:rPr>
+          <w:rStyle w:val="NormalTok"/>
+        </w:rPr>
+        <w:t xml:space="preserve">  </w:t>
+      </w:r>
+      <w:r>
+        <w:rPr>
+          <w:rStyle w:val="KeywordTok"/>
+        </w:rPr>
+        <w:t xml:space="preserve">&amp;&amp;</w:t>
+      </w:r>
+      <w:r>
+        <w:rPr>
+          <w:rStyle w:val="NormalTok"/>
+        </w:rPr>
+        <w:t xml:space="preserve"> </w:t>
+      </w:r>
+      <w:r>
+        <w:rPr>
+          <w:rStyle w:val="KeywordTok"/>
+        </w:rPr>
+        <w:t xml:space="preserve">(</w:t>
+      </w:r>
+      <w:r>
+        <w:rPr>
+          <w:rStyle w:val="BuiltInTok"/>
+        </w:rPr>
+        <w:t xml:space="preserve">cd</w:t>
+      </w:r>
+      <w:r>
+        <w:rPr>
+          <w:rStyle w:val="NormalTok"/>
+        </w:rPr>
+        <w:t xml:space="preserve"> addon/SDCard </w:t>
+      </w:r>
+      <w:r>
+        <w:rPr>
+          <w:rStyle w:val="KeywordTok"/>
+        </w:rPr>
+        <w:t xml:space="preserve">&amp;&amp;</w:t>
+      </w:r>
+      <w:r>
+        <w:rPr>
+          <w:rStyle w:val="NormalTok"/>
+        </w:rPr>
+        <w:t xml:space="preserve"> </w:t>
+      </w:r>
+      <w:r>
+        <w:rPr>
+          <w:rStyle w:val="FunctionTok"/>
+        </w:rPr>
+        <w:t xml:space="preserve">make</w:t>
+      </w:r>
+      <w:r>
+        <w:rPr>
+          <w:rStyle w:val="NormalTok"/>
+        </w:rPr>
+        <w:t xml:space="preserve"> </w:t>
+      </w:r>
+      <w:r>
+        <w:rPr>
+          <w:rStyle w:val="AttributeTok"/>
+        </w:rPr>
+        <w:t xml:space="preserve">-j4</w:t>
+      </w:r>
+      <w:r>
+        <w:rPr>
+          <w:rStyle w:val="KeywordTok"/>
+        </w:rPr>
+        <w:t xml:space="preserve">)</w:t>
+      </w:r>
+      <w:r>
+        <w:rPr>
+          <w:rStyle w:val="NormalTok"/>
+        </w:rPr>
+        <w:t xml:space="preserve"> </w:t>
+      </w:r>
+      <w:r>
+        <w:rPr>
+          <w:rStyle w:val="DataTypeTok"/>
+        </w:rPr>
+        <w:t xml:space="preserve">\</w:t>
+      </w:r>
+      <w:r>
         <w:br/>
       </w:r>
       <w:r>
         <w:rPr>
-          <w:rStyle w:val="CommentTok"/>
-        </w:rPr>
-        <w:t xml:space="preserve"># Configure for RPi 4 / AArch64. DEPTH=32 is REQUIRED: our GImage renders 32-bit</w:t>
+          <w:rStyle w:val="NormalTok"/>
+        </w:rPr>
+        <w:t xml:space="preserve">  </w:t>
+      </w:r>
+      <w:r>
+        <w:rPr>
+          <w:rStyle w:val="KeywordTok"/>
+        </w:rPr>
+        <w:t xml:space="preserve">&amp;&amp;</w:t>
+      </w:r>
+      <w:r>
+        <w:rPr>
+          <w:rStyle w:val="NormalTok"/>
+        </w:rPr>
+        <w:t xml:space="preserve"> </w:t>
+      </w:r>
+      <w:r>
+        <w:rPr>
+          <w:rStyle w:val="KeywordTok"/>
+        </w:rPr>
+        <w:t xml:space="preserve">(</w:t>
+      </w:r>
+      <w:r>
+        <w:rPr>
+          <w:rStyle w:val="BuiltInTok"/>
+        </w:rPr>
+        <w:t xml:space="preserve">cd</w:t>
+      </w:r>
+      <w:r>
+        <w:rPr>
+          <w:rStyle w:val="NormalTok"/>
+        </w:rPr>
+        <w:t xml:space="preserve"> addon/fatfs </w:t>
+      </w:r>
+      <w:r>
+        <w:rPr>
+          <w:rStyle w:val="KeywordTok"/>
+        </w:rPr>
+        <w:t xml:space="preserve">&amp;&amp;</w:t>
+      </w:r>
+      <w:r>
+        <w:rPr>
+          <w:rStyle w:val="NormalTok"/>
+        </w:rPr>
+        <w:t xml:space="preserve"> </w:t>
+      </w:r>
+      <w:r>
+        <w:rPr>
+          <w:rStyle w:val="FunctionTok"/>
+        </w:rPr>
+        <w:t xml:space="preserve">make</w:t>
+      </w:r>
+      <w:r>
+        <w:rPr>
+          <w:rStyle w:val="NormalTok"/>
+        </w:rPr>
+        <w:t xml:space="preserve"> </w:t>
+      </w:r>
+      <w:r>
+        <w:rPr>
+          <w:rStyle w:val="AttributeTok"/>
+        </w:rPr>
+        <w:t xml:space="preserve">-j4</w:t>
+      </w:r>
+      <w:r>
+        <w:rPr>
+          <w:rStyle w:val="KeywordTok"/>
+        </w:rPr>
+        <w:t xml:space="preserve">)</w:t>
       </w:r>
       <w:r>
         <w:br/>
       </w:r>
       <w:r>
         <w:rPr>
-          <w:rStyle w:val="CommentTok"/>
-        </w:rPr>
-        <w:t xml:space="preserve"># pixels (Circle defaults to 16).</w:t>
-      </w:r>
-      <w:r>
-        <w:br/>
-      </w:r>
-      <w:r>
-        <w:rPr>
           <w:rStyle w:val="BuiltInTok"/>
         </w:rPr>
         <w:t xml:space="preserve">cd</w:t>
@@ -1054,738 +1740,6 @@
         <w:rPr>
           <w:rStyle w:val="NormalTok"/>
         </w:rPr>
-        <w:t xml:space="preserve"> circle </w:t>
-      </w:r>
-      <w:r>
-        <w:rPr>
-          <w:rStyle w:val="KeywordTok"/>
-        </w:rPr>
-        <w:t xml:space="preserve">&amp;&amp;</w:t>
-      </w:r>
-      <w:r>
-        <w:rPr>
-          <w:rStyle w:val="NormalTok"/>
-        </w:rPr>
-        <w:t xml:space="preserve"> </w:t>
-      </w:r>
-      <w:r>
-        <w:rPr>
-          <w:rStyle w:val="ExtensionTok"/>
-        </w:rPr>
-        <w:t xml:space="preserve">./configure</w:t>
-      </w:r>
-      <w:r>
-        <w:rPr>
-          <w:rStyle w:val="NormalTok"/>
-        </w:rPr>
-        <w:t xml:space="preserve"> </w:t>
-      </w:r>
-      <w:r>
-        <w:rPr>
-          <w:rStyle w:val="AttributeTok"/>
-        </w:rPr>
-        <w:t xml:space="preserve">-r</w:t>
-      </w:r>
-      <w:r>
-        <w:rPr>
-          <w:rStyle w:val="NormalTok"/>
-        </w:rPr>
-        <w:t xml:space="preserve"> 4 </w:t>
-      </w:r>
-      <w:r>
-        <w:rPr>
-          <w:rStyle w:val="AttributeTok"/>
-        </w:rPr>
-        <w:t xml:space="preserve">-p</w:t>
-      </w:r>
-      <w:r>
-        <w:rPr>
-          <w:rStyle w:val="NormalTok"/>
-        </w:rPr>
-        <w:t xml:space="preserve"> aarch64-none-elf- </w:t>
-      </w:r>
-      <w:r>
-        <w:rPr>
-          <w:rStyle w:val="AttributeTok"/>
-        </w:rPr>
-        <w:t xml:space="preserve">-d</w:t>
-      </w:r>
-      <w:r>
-        <w:rPr>
-          <w:rStyle w:val="NormalTok"/>
-        </w:rPr>
-        <w:t xml:space="preserve"> DEPTH=32 </w:t>
-      </w:r>
-      <w:r>
-        <w:rPr>
-          <w:rStyle w:val="AttributeTok"/>
-        </w:rPr>
-        <w:t xml:space="preserve">-f</w:t>
-      </w:r>
-      <w:r>
-        <w:br/>
-      </w:r>
-      <w:r>
-        <w:br/>
-      </w:r>
-      <w:r>
-        <w:rPr>
-          <w:rStyle w:val="CommentTok"/>
-        </w:rPr>
-        <w:t xml:space="preserve"># Build the libraries used by the kernel:</w:t>
-      </w:r>
-      <w:r>
-        <w:br/>
-      </w:r>
-      <w:r>
-        <w:rPr>
-          <w:rStyle w:val="KeywordTok"/>
-        </w:rPr>
-        <w:t xml:space="preserve">(</w:t>
-      </w:r>
-      <w:r>
-        <w:rPr>
-          <w:rStyle w:val="BuiltInTok"/>
-        </w:rPr>
-        <w:t xml:space="preserve">cd</w:t>
-      </w:r>
-      <w:r>
-        <w:rPr>
-          <w:rStyle w:val="NormalTok"/>
-        </w:rPr>
-        <w:t xml:space="preserve"> lib </w:t>
-      </w:r>
-      <w:r>
-        <w:rPr>
-          <w:rStyle w:val="KeywordTok"/>
-        </w:rPr>
-        <w:t xml:space="preserve">&amp;&amp;</w:t>
-      </w:r>
-      <w:r>
-        <w:rPr>
-          <w:rStyle w:val="NormalTok"/>
-        </w:rPr>
-        <w:t xml:space="preserve"> </w:t>
-      </w:r>
-      <w:r>
-        <w:rPr>
-          <w:rStyle w:val="FunctionTok"/>
-        </w:rPr>
-        <w:t xml:space="preserve">make</w:t>
-      </w:r>
-      <w:r>
-        <w:rPr>
-          <w:rStyle w:val="NormalTok"/>
-        </w:rPr>
-        <w:t xml:space="preserve"> </w:t>
-      </w:r>
-      <w:r>
-        <w:rPr>
-          <w:rStyle w:val="AttributeTok"/>
-        </w:rPr>
-        <w:t xml:space="preserve">-j4</w:t>
-      </w:r>
-      <w:r>
-        <w:rPr>
-          <w:rStyle w:val="KeywordTok"/>
-        </w:rPr>
-        <w:t xml:space="preserve">)</w:t>
-      </w:r>
-      <w:r>
-        <w:rPr>
-          <w:rStyle w:val="NormalTok"/>
-        </w:rPr>
-        <w:t xml:space="preserve"> </w:t>
-      </w:r>
-      <w:r>
-        <w:rPr>
-          <w:rStyle w:val="DataTypeTok"/>
-        </w:rPr>
-        <w:t xml:space="preserve">\</w:t>
-      </w:r>
-      <w:r>
-        <w:br/>
-      </w:r>
-      <w:r>
-        <w:rPr>
-          <w:rStyle w:val="NormalTok"/>
-        </w:rPr>
-        <w:t xml:space="preserve">  </w:t>
-      </w:r>
-      <w:r>
-        <w:rPr>
-          <w:rStyle w:val="KeywordTok"/>
-        </w:rPr>
-        <w:t xml:space="preserve">&amp;&amp;</w:t>
-      </w:r>
-      <w:r>
-        <w:rPr>
-          <w:rStyle w:val="NormalTok"/>
-        </w:rPr>
-        <w:t xml:space="preserve"> </w:t>
-      </w:r>
-      <w:r>
-        <w:rPr>
-          <w:rStyle w:val="KeywordTok"/>
-        </w:rPr>
-        <w:t xml:space="preserve">(</w:t>
-      </w:r>
-      <w:r>
-        <w:rPr>
-          <w:rStyle w:val="BuiltInTok"/>
-        </w:rPr>
-        <w:t xml:space="preserve">cd</w:t>
-      </w:r>
-      <w:r>
-        <w:rPr>
-          <w:rStyle w:val="NormalTok"/>
-        </w:rPr>
-        <w:t xml:space="preserve"> lib/sched </w:t>
-      </w:r>
-      <w:r>
-        <w:rPr>
-          <w:rStyle w:val="KeywordTok"/>
-        </w:rPr>
-        <w:t xml:space="preserve">&amp;&amp;</w:t>
-      </w:r>
-      <w:r>
-        <w:rPr>
-          <w:rStyle w:val="NormalTok"/>
-        </w:rPr>
-        <w:t xml:space="preserve"> </w:t>
-      </w:r>
-      <w:r>
-        <w:rPr>
-          <w:rStyle w:val="FunctionTok"/>
-        </w:rPr>
-        <w:t xml:space="preserve">make</w:t>
-      </w:r>
-      <w:r>
-        <w:rPr>
-          <w:rStyle w:val="NormalTok"/>
-        </w:rPr>
-        <w:t xml:space="preserve"> </w:t>
-      </w:r>
-      <w:r>
-        <w:rPr>
-          <w:rStyle w:val="AttributeTok"/>
-        </w:rPr>
-        <w:t xml:space="preserve">-j4</w:t>
-      </w:r>
-      <w:r>
-        <w:rPr>
-          <w:rStyle w:val="KeywordTok"/>
-        </w:rPr>
-        <w:t xml:space="preserve">)</w:t>
-      </w:r>
-      <w:r>
-        <w:rPr>
-          <w:rStyle w:val="NormalTok"/>
-        </w:rPr>
-        <w:t xml:space="preserve"> </w:t>
-      </w:r>
-      <w:r>
-        <w:rPr>
-          <w:rStyle w:val="DataTypeTok"/>
-        </w:rPr>
-        <w:t xml:space="preserve">\</w:t>
-      </w:r>
-      <w:r>
-        <w:br/>
-      </w:r>
-      <w:r>
-        <w:rPr>
-          <w:rStyle w:val="NormalTok"/>
-        </w:rPr>
-        <w:t xml:space="preserve">  </w:t>
-      </w:r>
-      <w:r>
-        <w:rPr>
-          <w:rStyle w:val="KeywordTok"/>
-        </w:rPr>
-        <w:t xml:space="preserve">&amp;&amp;</w:t>
-      </w:r>
-      <w:r>
-        <w:rPr>
-          <w:rStyle w:val="NormalTok"/>
-        </w:rPr>
-        <w:t xml:space="preserve"> </w:t>
-      </w:r>
-      <w:r>
-        <w:rPr>
-          <w:rStyle w:val="KeywordTok"/>
-        </w:rPr>
-        <w:t xml:space="preserve">(</w:t>
-      </w:r>
-      <w:r>
-        <w:rPr>
-          <w:rStyle w:val="BuiltInTok"/>
-        </w:rPr>
-        <w:t xml:space="preserve">cd</w:t>
-      </w:r>
-      <w:r>
-        <w:rPr>
-          <w:rStyle w:val="NormalTok"/>
-        </w:rPr>
-        <w:t xml:space="preserve"> lib/fs </w:t>
-      </w:r>
-      <w:r>
-        <w:rPr>
-          <w:rStyle w:val="KeywordTok"/>
-        </w:rPr>
-        <w:t xml:space="preserve">&amp;&amp;</w:t>
-      </w:r>
-      <w:r>
-        <w:rPr>
-          <w:rStyle w:val="NormalTok"/>
-        </w:rPr>
-        <w:t xml:space="preserve"> </w:t>
-      </w:r>
-      <w:r>
-        <w:rPr>
-          <w:rStyle w:val="FunctionTok"/>
-        </w:rPr>
-        <w:t xml:space="preserve">make</w:t>
-      </w:r>
-      <w:r>
-        <w:rPr>
-          <w:rStyle w:val="NormalTok"/>
-        </w:rPr>
-        <w:t xml:space="preserve"> </w:t>
-      </w:r>
-      <w:r>
-        <w:rPr>
-          <w:rStyle w:val="AttributeTok"/>
-        </w:rPr>
-        <w:t xml:space="preserve">-j4</w:t>
-      </w:r>
-      <w:r>
-        <w:rPr>
-          <w:rStyle w:val="NormalTok"/>
-        </w:rPr>
-        <w:t xml:space="preserve"> </w:t>
-      </w:r>
-      <w:r>
-        <w:rPr>
-          <w:rStyle w:val="KeywordTok"/>
-        </w:rPr>
-        <w:t xml:space="preserve">&amp;&amp;</w:t>
-      </w:r>
-      <w:r>
-        <w:rPr>
-          <w:rStyle w:val="NormalTok"/>
-        </w:rPr>
-        <w:t xml:space="preserve"> </w:t>
-      </w:r>
-      <w:r>
-        <w:rPr>
-          <w:rStyle w:val="BuiltInTok"/>
-        </w:rPr>
-        <w:t xml:space="preserve">cd</w:t>
-      </w:r>
-      <w:r>
-        <w:rPr>
-          <w:rStyle w:val="NormalTok"/>
-        </w:rPr>
-        <w:t xml:space="preserve"> fat </w:t>
-      </w:r>
-      <w:r>
-        <w:rPr>
-          <w:rStyle w:val="KeywordTok"/>
-        </w:rPr>
-        <w:t xml:space="preserve">&amp;&amp;</w:t>
-      </w:r>
-      <w:r>
-        <w:rPr>
-          <w:rStyle w:val="NormalTok"/>
-        </w:rPr>
-        <w:t xml:space="preserve"> </w:t>
-      </w:r>
-      <w:r>
-        <w:rPr>
-          <w:rStyle w:val="FunctionTok"/>
-        </w:rPr>
-        <w:t xml:space="preserve">make</w:t>
-      </w:r>
-      <w:r>
-        <w:rPr>
-          <w:rStyle w:val="NormalTok"/>
-        </w:rPr>
-        <w:t xml:space="preserve"> </w:t>
-      </w:r>
-      <w:r>
-        <w:rPr>
-          <w:rStyle w:val="AttributeTok"/>
-        </w:rPr>
-        <w:t xml:space="preserve">-j4</w:t>
-      </w:r>
-      <w:r>
-        <w:rPr>
-          <w:rStyle w:val="KeywordTok"/>
-        </w:rPr>
-        <w:t xml:space="preserve">)</w:t>
-      </w:r>
-      <w:r>
-        <w:rPr>
-          <w:rStyle w:val="NormalTok"/>
-        </w:rPr>
-        <w:t xml:space="preserve"> </w:t>
-      </w:r>
-      <w:r>
-        <w:rPr>
-          <w:rStyle w:val="DataTypeTok"/>
-        </w:rPr>
-        <w:t xml:space="preserve">\</w:t>
-      </w:r>
-      <w:r>
-        <w:br/>
-      </w:r>
-      <w:r>
-        <w:rPr>
-          <w:rStyle w:val="NormalTok"/>
-        </w:rPr>
-        <w:t xml:space="preserve">  </w:t>
-      </w:r>
-      <w:r>
-        <w:rPr>
-          <w:rStyle w:val="KeywordTok"/>
-        </w:rPr>
-        <w:t xml:space="preserve">&amp;&amp;</w:t>
-      </w:r>
-      <w:r>
-        <w:rPr>
-          <w:rStyle w:val="NormalTok"/>
-        </w:rPr>
-        <w:t xml:space="preserve"> </w:t>
-      </w:r>
-      <w:r>
-        <w:rPr>
-          <w:rStyle w:val="KeywordTok"/>
-        </w:rPr>
-        <w:t xml:space="preserve">(</w:t>
-      </w:r>
-      <w:r>
-        <w:rPr>
-          <w:rStyle w:val="BuiltInTok"/>
-        </w:rPr>
-        <w:t xml:space="preserve">cd</w:t>
-      </w:r>
-      <w:r>
-        <w:rPr>
-          <w:rStyle w:val="NormalTok"/>
-        </w:rPr>
-        <w:t xml:space="preserve"> lib/usb </w:t>
-      </w:r>
-      <w:r>
-        <w:rPr>
-          <w:rStyle w:val="KeywordTok"/>
-        </w:rPr>
-        <w:t xml:space="preserve">&amp;&amp;</w:t>
-      </w:r>
-      <w:r>
-        <w:rPr>
-          <w:rStyle w:val="NormalTok"/>
-        </w:rPr>
-        <w:t xml:space="preserve"> </w:t>
-      </w:r>
-      <w:r>
-        <w:rPr>
-          <w:rStyle w:val="FunctionTok"/>
-        </w:rPr>
-        <w:t xml:space="preserve">make</w:t>
-      </w:r>
-      <w:r>
-        <w:rPr>
-          <w:rStyle w:val="NormalTok"/>
-        </w:rPr>
-        <w:t xml:space="preserve"> </w:t>
-      </w:r>
-      <w:r>
-        <w:rPr>
-          <w:rStyle w:val="AttributeTok"/>
-        </w:rPr>
-        <w:t xml:space="preserve">-j4</w:t>
-      </w:r>
-      <w:r>
-        <w:rPr>
-          <w:rStyle w:val="KeywordTok"/>
-        </w:rPr>
-        <w:t xml:space="preserve">)</w:t>
-      </w:r>
-      <w:r>
-        <w:rPr>
-          <w:rStyle w:val="NormalTok"/>
-        </w:rPr>
-        <w:t xml:space="preserve"> </w:t>
-      </w:r>
-      <w:r>
-        <w:rPr>
-          <w:rStyle w:val="DataTypeTok"/>
-        </w:rPr>
-        <w:t xml:space="preserve">\</w:t>
-      </w:r>
-      <w:r>
-        <w:br/>
-      </w:r>
-      <w:r>
-        <w:rPr>
-          <w:rStyle w:val="NormalTok"/>
-        </w:rPr>
-        <w:t xml:space="preserve">  </w:t>
-      </w:r>
-      <w:r>
-        <w:rPr>
-          <w:rStyle w:val="KeywordTok"/>
-        </w:rPr>
-        <w:t xml:space="preserve">&amp;&amp;</w:t>
-      </w:r>
-      <w:r>
-        <w:rPr>
-          <w:rStyle w:val="NormalTok"/>
-        </w:rPr>
-        <w:t xml:space="preserve"> </w:t>
-      </w:r>
-      <w:r>
-        <w:rPr>
-          <w:rStyle w:val="KeywordTok"/>
-        </w:rPr>
-        <w:t xml:space="preserve">(</w:t>
-      </w:r>
-      <w:r>
-        <w:rPr>
-          <w:rStyle w:val="BuiltInTok"/>
-        </w:rPr>
-        <w:t xml:space="preserve">cd</w:t>
-      </w:r>
-      <w:r>
-        <w:rPr>
-          <w:rStyle w:val="NormalTok"/>
-        </w:rPr>
-        <w:t xml:space="preserve"> lib/input </w:t>
-      </w:r>
-      <w:r>
-        <w:rPr>
-          <w:rStyle w:val="KeywordTok"/>
-        </w:rPr>
-        <w:t xml:space="preserve">&amp;&amp;</w:t>
-      </w:r>
-      <w:r>
-        <w:rPr>
-          <w:rStyle w:val="NormalTok"/>
-        </w:rPr>
-        <w:t xml:space="preserve"> </w:t>
-      </w:r>
-      <w:r>
-        <w:rPr>
-          <w:rStyle w:val="FunctionTok"/>
-        </w:rPr>
-        <w:t xml:space="preserve">make</w:t>
-      </w:r>
-      <w:r>
-        <w:rPr>
-          <w:rStyle w:val="NormalTok"/>
-        </w:rPr>
-        <w:t xml:space="preserve"> </w:t>
-      </w:r>
-      <w:r>
-        <w:rPr>
-          <w:rStyle w:val="AttributeTok"/>
-        </w:rPr>
-        <w:t xml:space="preserve">-j4</w:t>
-      </w:r>
-      <w:r>
-        <w:rPr>
-          <w:rStyle w:val="KeywordTok"/>
-        </w:rPr>
-        <w:t xml:space="preserve">)</w:t>
-      </w:r>
-      <w:r>
-        <w:rPr>
-          <w:rStyle w:val="NormalTok"/>
-        </w:rPr>
-        <w:t xml:space="preserve"> </w:t>
-      </w:r>
-      <w:r>
-        <w:rPr>
-          <w:rStyle w:val="DataTypeTok"/>
-        </w:rPr>
-        <w:t xml:space="preserve">\</w:t>
-      </w:r>
-      <w:r>
-        <w:br/>
-      </w:r>
-      <w:r>
-        <w:rPr>
-          <w:rStyle w:val="NormalTok"/>
-        </w:rPr>
-        <w:t xml:space="preserve">  </w:t>
-      </w:r>
-      <w:r>
-        <w:rPr>
-          <w:rStyle w:val="KeywordTok"/>
-        </w:rPr>
-        <w:t xml:space="preserve">&amp;&amp;</w:t>
-      </w:r>
-      <w:r>
-        <w:rPr>
-          <w:rStyle w:val="NormalTok"/>
-        </w:rPr>
-        <w:t xml:space="preserve"> </w:t>
-      </w:r>
-      <w:r>
-        <w:rPr>
-          <w:rStyle w:val="KeywordTok"/>
-        </w:rPr>
-        <w:t xml:space="preserve">(</w:t>
-      </w:r>
-      <w:r>
-        <w:rPr>
-          <w:rStyle w:val="BuiltInTok"/>
-        </w:rPr>
-        <w:t xml:space="preserve">cd</w:t>
-      </w:r>
-      <w:r>
-        <w:rPr>
-          <w:rStyle w:val="NormalTok"/>
-        </w:rPr>
-        <w:t xml:space="preserve"> addon/SDCard </w:t>
-      </w:r>
-      <w:r>
-        <w:rPr>
-          <w:rStyle w:val="KeywordTok"/>
-        </w:rPr>
-        <w:t xml:space="preserve">&amp;&amp;</w:t>
-      </w:r>
-      <w:r>
-        <w:rPr>
-          <w:rStyle w:val="NormalTok"/>
-        </w:rPr>
-        <w:t xml:space="preserve"> </w:t>
-      </w:r>
-      <w:r>
-        <w:rPr>
-          <w:rStyle w:val="FunctionTok"/>
-        </w:rPr>
-        <w:t xml:space="preserve">make</w:t>
-      </w:r>
-      <w:r>
-        <w:rPr>
-          <w:rStyle w:val="NormalTok"/>
-        </w:rPr>
-        <w:t xml:space="preserve"> </w:t>
-      </w:r>
-      <w:r>
-        <w:rPr>
-          <w:rStyle w:val="AttributeTok"/>
-        </w:rPr>
-        <w:t xml:space="preserve">-j4</w:t>
-      </w:r>
-      <w:r>
-        <w:rPr>
-          <w:rStyle w:val="KeywordTok"/>
-        </w:rPr>
-        <w:t xml:space="preserve">)</w:t>
-      </w:r>
-      <w:r>
-        <w:rPr>
-          <w:rStyle w:val="NormalTok"/>
-        </w:rPr>
-        <w:t xml:space="preserve"> </w:t>
-      </w:r>
-      <w:r>
-        <w:rPr>
-          <w:rStyle w:val="DataTypeTok"/>
-        </w:rPr>
-        <w:t xml:space="preserve">\</w:t>
-      </w:r>
-      <w:r>
-        <w:br/>
-      </w:r>
-      <w:r>
-        <w:rPr>
-          <w:rStyle w:val="NormalTok"/>
-        </w:rPr>
-        <w:t xml:space="preserve">  </w:t>
-      </w:r>
-      <w:r>
-        <w:rPr>
-          <w:rStyle w:val="KeywordTok"/>
-        </w:rPr>
-        <w:t xml:space="preserve">&amp;&amp;</w:t>
-      </w:r>
-      <w:r>
-        <w:rPr>
-          <w:rStyle w:val="NormalTok"/>
-        </w:rPr>
-        <w:t xml:space="preserve"> </w:t>
-      </w:r>
-      <w:r>
-        <w:rPr>
-          <w:rStyle w:val="KeywordTok"/>
-        </w:rPr>
-        <w:t xml:space="preserve">(</w:t>
-      </w:r>
-      <w:r>
-        <w:rPr>
-          <w:rStyle w:val="BuiltInTok"/>
-        </w:rPr>
-        <w:t xml:space="preserve">cd</w:t>
-      </w:r>
-      <w:r>
-        <w:rPr>
-          <w:rStyle w:val="NormalTok"/>
-        </w:rPr>
-        <w:t xml:space="preserve"> addon/fatfs </w:t>
-      </w:r>
-      <w:r>
-        <w:rPr>
-          <w:rStyle w:val="KeywordTok"/>
-        </w:rPr>
-        <w:t xml:space="preserve">&amp;&amp;</w:t>
-      </w:r>
-      <w:r>
-        <w:rPr>
-          <w:rStyle w:val="NormalTok"/>
-        </w:rPr>
-        <w:t xml:space="preserve"> </w:t>
-      </w:r>
-      <w:r>
-        <w:rPr>
-          <w:rStyle w:val="FunctionTok"/>
-        </w:rPr>
-        <w:t xml:space="preserve">make</w:t>
-      </w:r>
-      <w:r>
-        <w:rPr>
-          <w:rStyle w:val="NormalTok"/>
-        </w:rPr>
-        <w:t xml:space="preserve"> </w:t>
-      </w:r>
-      <w:r>
-        <w:rPr>
-          <w:rStyle w:val="AttributeTok"/>
-        </w:rPr>
-        <w:t xml:space="preserve">-j4</w:t>
-      </w:r>
-      <w:r>
-        <w:rPr>
-          <w:rStyle w:val="KeywordTok"/>
-        </w:rPr>
-        <w:t xml:space="preserve">)</w:t>
-      </w:r>
-      <w:r>
-        <w:br/>
-      </w:r>
-      <w:r>
-        <w:rPr>
-          <w:rStyle w:val="BuiltInTok"/>
-        </w:rPr>
-        <w:t xml:space="preserve">cd</w:t>
-      </w:r>
-      <w:r>
-        <w:rPr>
-          <w:rStyle w:val="NormalTok"/>
-        </w:rPr>
         <w:t xml:space="preserve"> ..</w:t>
       </w:r>
     </w:p>
@@ -1885,7 +1839,7 @@
       <w:r>
         <w:t xml:space="preserve"> </w:t>
       </w:r>
-      <w:hyperlink r:id="rId21">
+      <w:hyperlink r:id="rId22">
         <w:r>
           <w:rPr>
             <w:rStyle w:val="VerbatimChar"/>
@@ -2021,7 +1975,7 @@
       <w:r>
         <w:t xml:space="preserve"> </w:t>
       </w:r>
-      <w:hyperlink r:id="rId22">
+      <w:hyperlink r:id="rId20">
         <w:r>
           <w:rPr>
             <w:rStyle w:val="Hyperlink"/>

</xml_diff>

<commit_message>
docs: NetSurf runs on Onyx (no-window hang fixed)
After the -f onyx surface fix, NetSurf opens a window and renders real web pages through the
full HTML/CSS engine (currently slow). Update the status: brick 9 is done end-to-end, NetSurf
is no longer parked. user/netsurf/README.md gains a Performance section (blocking/serial
fetch, full-screen present, loop cadence) and the dev/user guides + exports are updated;
NetSurf is catalogued as an app alongside httpc.

Co-Authored-By: Claude Opus 4.8 <noreply@anthropic.com>
</commit_message>
<xml_diff>
--- a/docs/exports/03-DEVELOPER-GUIDE.docx
+++ b/docs/exports/03-DEVELOPER-GUIDE.docx
@@ -10121,7 +10121,7 @@
         </w:r>
       </w:hyperlink>
       <w:r>
-        <w:t xml:space="preserve">) that</w:t>
+        <w:t xml:space="preserve">) —</w:t>
       </w:r>
       <w:r>
         <w:t xml:space="preserve"> </w:t>
@@ -10133,13 +10133,29 @@
         <w:t xml:space="preserve"> </w:t>
       </w:r>
       <w:r>
-        <w:t xml:space="preserve">role without libcurl — is drafted and compiles against the real fetcher API. The remaining</w:t>
-      </w:r>
-      <w:r>
-        <w:t xml:space="preserve"> </w:t>
-      </w:r>
-      <w:r>
-        <w:t xml:space="preserve">brick is the NetSurf core + an Onyx framebuffer frontend wiring it all to</w:t>
+        <w:t xml:space="preserve">role without libcurl. Brick 9 wires the whole</w:t>
+      </w:r>
+      <w:r>
+        <w:t xml:space="preserve"> </w:t>
+      </w:r>
+      <w:r>
+        <w:rPr>
+          <w:b/>
+          <w:bCs/>
+        </w:rPr>
+        <w:t xml:space="preserve">NetSurf core + its framebuffer frontend</w:t>
+      </w:r>
+      <w:r>
+        <w:t xml:space="preserve"> </w:t>
+      </w:r>
+      <w:r>
+        <w:t xml:space="preserve">to</w:t>
+      </w:r>
+      <w:r>
+        <w:t xml:space="preserve"> </w:t>
+      </w:r>
+      <w:r>
+        <w:t xml:space="preserve">the</w:t>
       </w:r>
       <w:r>
         <w:t xml:space="preserve"> </w:t>
@@ -10154,7 +10170,16 @@
         <w:t xml:space="preserve"> </w:t>
       </w:r>
       <w:r>
-        <w:t xml:space="preserve">+</w:t>
+        <w:rPr>
+          <w:rStyle w:val="VerbatimChar"/>
+        </w:rPr>
+        <w:t xml:space="preserve">"onyx"</w:t>
+      </w:r>
+      <w:r>
+        <w:t xml:space="preserve"> </w:t>
+      </w:r>
+      <w:r>
+        <w:t xml:space="preserve">libnsfb surface + the</w:t>
       </w:r>
       <w:r>
         <w:t xml:space="preserve"> </w:t>
@@ -10165,6 +10190,156 @@
         </w:rPr>
         <w:t xml:space="preserve">user/img</w:t>
       </w:r>
+      <w:r>
+        <w:t xml:space="preserve"> </w:t>
+      </w:r>
+      <w:r>
+        <w:t xml:space="preserve">decoders:</w:t>
+      </w:r>
+      <w:r>
+        <w:t xml:space="preserve"> </w:t>
+      </w:r>
+      <w:r>
+        <w:rPr>
+          <w:rStyle w:val="VerbatimChar"/>
+        </w:rPr>
+        <w:t xml:space="preserve">make -f user/netsurf/netsurf-app.mk stage</w:t>
+      </w:r>
+      <w:r>
+        <w:t xml:space="preserve"> </w:t>
+      </w:r>
+      <w:r>
+        <w:t xml:space="preserve">builds</w:t>
+      </w:r>
+      <w:r>
+        <w:t xml:space="preserve"> </w:t>
+      </w:r>
+      <w:r>
+        <w:rPr>
+          <w:rStyle w:val="VerbatimChar"/>
+        </w:rPr>
+        <w:t xml:space="preserve">netsurf.elf</w:t>
+      </w:r>
+      <w:r>
+        <w:t xml:space="preserve"> </w:t>
+      </w:r>
+      <w:r>
+        <w:t xml:space="preserve">(182 TUs + the libs) and installs it</w:t>
+      </w:r>
+      <w:r>
+        <w:t xml:space="preserve"> </w:t>
+      </w:r>
+      <w:r>
+        <w:t xml:space="preserve">as the</w:t>
+      </w:r>
+      <w:r>
+        <w:t xml:space="preserve"> </w:t>
+      </w:r>
+      <w:r>
+        <w:rPr>
+          <w:rStyle w:val="VerbatimChar"/>
+        </w:rPr>
+        <w:t xml:space="preserve">NetSurf</w:t>
+      </w:r>
+      <w:r>
+        <w:t xml:space="preserve"> </w:t>
+      </w:r>
+      <w:r>
+        <w:t xml:space="preserve">desktop app.</w:t>
+      </w:r>
+      <w:r>
+        <w:t xml:space="preserve"> </w:t>
+      </w:r>
+      <w:r>
+        <w:rPr>
+          <w:b/>
+          <w:bCs/>
+        </w:rPr>
+        <w:t xml:space="preserve">It runs on Onyx</w:t>
+      </w:r>
+      <w:r>
+        <w:t xml:space="preserve"> </w:t>
+      </w:r>
+      <w:r>
+        <w:t xml:space="preserve">— the window opens and real web pages render</w:t>
+      </w:r>
+      <w:r>
+        <w:t xml:space="preserve"> </w:t>
+      </w:r>
+      <w:r>
+        <w:t xml:space="preserve">through the full HTML/CSS engine (currently slow; the</w:t>
+      </w:r>
+      <w:r>
+        <w:t xml:space="preserve"> </w:t>
+      </w:r>
+      <w:r>
+        <w:rPr>
+          <w:rStyle w:val="VerbatimChar"/>
+        </w:rPr>
+        <w:t xml:space="preserve">onyx_main.c</w:t>
+      </w:r>
+      <w:r>
+        <w:t xml:space="preserve"> </w:t>
+      </w:r>
+      <w:r>
+        <w:t xml:space="preserve">entry shim passes</w:t>
+      </w:r>
+      <w:r>
+        <w:t xml:space="preserve"> </w:t>
+      </w:r>
+      <w:r>
+        <w:rPr>
+          <w:rStyle w:val="VerbatimChar"/>
+        </w:rPr>
+        <w:t xml:space="preserve">-f onyx</w:t>
+      </w:r>
+      <w:r>
+        <w:t xml:space="preserve"> </w:t>
+      </w:r>
+      <w:r>
+        <w:t xml:space="preserve">to select the window surface). A console</w:t>
+      </w:r>
+      <w:r>
+        <w:t xml:space="preserve"> </w:t>
+      </w:r>
+      <w:r>
+        <w:rPr>
+          <w:rStyle w:val="VerbatimChar"/>
+        </w:rPr>
+        <w:t xml:space="preserve">nstest</w:t>
+      </w:r>
+      <w:r>
+        <w:t xml:space="preserve"> </w:t>
+      </w:r>
+      <w:r>
+        <w:t xml:space="preserve">(</w:t>
+      </w:r>
+      <w:r>
+        <w:rPr>
+          <w:rStyle w:val="VerbatimChar"/>
+        </w:rPr>
+        <w:t xml:space="preserve">netsurf-app.mk nstest</w:t>
+      </w:r>
+      <w:r>
+        <w:t xml:space="preserve">) smoke-</w:t>
+      </w:r>
+      <w:r>
+        <w:t xml:space="preserve"> </w:t>
+      </w:r>
+      <w:r>
+        <w:t xml:space="preserve">tests each library brick. See</w:t>
+      </w:r>
+      <w:r>
+        <w:t xml:space="preserve"> </w:t>
+      </w:r>
+      <w:hyperlink r:id="rId50">
+        <w:r>
+          <w:rPr>
+            <w:rStyle w:val="VerbatimChar"/>
+          </w:rPr>
+          <w:t xml:space="preserve">user/netsurf/README.md</w:t>
+        </w:r>
+      </w:hyperlink>
       <w:r>
         <w:t xml:space="preserve">.</w:t>
       </w:r>

</xml_diff>